<commit_message>
Fix contract cost/discount XML, add saveToCloud to KP download
Co-Authored-By: Claude Sonnet 4.6 <noreply@anthropic.com>
</commit_message>
<xml_diff>
--- a/contract_ip_template.docx
+++ b/contract_ip_template.docx
@@ -1863,42 +1863,92 @@
           <w:ilvl w:val="1"/>
           <w:numId w:val="10"/>
         </w:numPr>
-        <w:p>
-          <w:pPr>
-            <w:spacing w:after="0" w:before="0" w:line="240" w:lineRule="auto"/>
-            <w:ind w:left="0" w:right="0" w:firstLine="567"/>
-            <w:jc w:val="both"/>
-            <w:rPr/>
-          </w:pPr>
-          <w:r>
-            <w:rPr>
-              <w:rFonts w:ascii="Trebuchet MS" w:cs="Trebuchet MS" w:eastAsia="Trebuchet MS" w:hAnsi="Trebuchet MS"/>
-              <w:b w:val="0"/>
-              <w:color w:val="000000"/>
-              <w:sz w:val="22"/>
-              <w:szCs w:val="22"/>
-            </w:rPr>
-            <w:t xml:space="preserve">Стоимость услуг составляет {{total_amount}} ({{total_amount_words}}) рублей в месяц.</w:t>
-          </w:r>
-        </w:p>
-        <w:p>
-          <w:pPr>
-            <w:spacing w:after="0" w:before="0" w:line="240" w:lineRule="auto"/>
-            <w:ind w:left="0" w:right="0" w:firstLine="567"/>
-            <w:jc w:val="both"/>
-            <w:rPr/>
-          </w:pPr>
-          <w:r>
-            <w:rPr>
-              <w:rFonts w:ascii="Trebuchet MS" w:cs="Trebuchet MS" w:eastAsia="Trebuchet MS" w:hAnsi="Trebuchet MS"/>
-              <w:b w:val="0"/>
-              <w:color w:val="000000"/>
-              <w:sz w:val="22"/>
-              <w:szCs w:val="22"/>
-            </w:rPr>
-            <w:t xml:space="preserve">{{#show_discount}}С учётом скидки {{discount_percent}}% (первоначальная стоимость — {{original_amount}} руб./мес.).{{/show_discount}}</w:t>
-          </w:r>
-        </w:p>
+        <w:pBdr>
+          <w:top w:color="000000" w:space="0" w:sz="0" w:val="none"/>
+          <w:left w:color="000000" w:space="0" w:sz="0" w:val="none"/>
+          <w:bottom w:color="000000" w:space="0" w:sz="0" w:val="none"/>
+          <w:right w:color="000000" w:space="0" w:sz="0" w:val="none"/>
+          <w:between w:color="000000" w:space="0" w:sz="0" w:val="none"/>
+        </w:pBdr>
+        <w:shd w:fill="auto" w:val="clear"/>
+        <w:spacing w:after="0" w:before="0" w:line="240" w:lineRule="auto"/>
+        <w:ind w:left="0" w:right="0" w:firstLine="567"/>
+        <w:jc w:val="both"/>
+        <w:rPr/>
+      </w:pPr>
+      <w:r>
+        <w:rPr>
+          <w:rFonts w:ascii="Trebuchet MS" w:cs="Trebuchet MS" w:eastAsia="Trebuchet MS" w:hAnsi="Trebuchet MS"/>
+          <w:b w:val="0"/>
+          <w:bCs w:val="0"/>
+          <w:i w:val="0"/>
+          <w:iCs w:val="0"/>
+          <w:smallCaps w:val="0"/>
+          <w:strike w:val="0"/>
+          <w:color w:val="000000"/>
+          <w:sz w:val="22"/>
+          <w:szCs w:val="22"/>
+          <w:u w:val="none"/>
+          <w:shd w:fill="auto" w:val="clear"/>
+          <w:vertAlign w:val="baseline"/>
+          <w:rtl w:val="0"/>
+        </w:rPr>
+        <w:t xml:space="preserve">{{total_amount}} ({{total_amount_words}}) рублей в месяц — стоимость услуг по настоящему договору.</w:t>
+      </w:r>
+    </w:p>
+    <w:p>
+      <w:pPr>
+        <w:keepNext w:val="0"/>
+        <w:keepLines w:val="0"/>
+        <w:pageBreakBefore w:val="0"/>
+        <w:widowControl w:val="0"/>
+        <w:numPr>
+          <w:ilvl w:val="1"/>
+          <w:numId w:val="10"/>
+        </w:numPr>
+        <w:pBdr>
+          <w:top w:color="000000" w:space="0" w:sz="0" w:val="none"/>
+          <w:left w:color="000000" w:space="0" w:sz="0" w:val="none"/>
+          <w:bottom w:color="000000" w:space="0" w:sz="0" w:val="none"/>
+          <w:right w:color="000000" w:space="0" w:sz="0" w:val="none"/>
+          <w:between w:color="000000" w:space="0" w:sz="0" w:val="none"/>
+        </w:pBdr>
+        <w:shd w:fill="auto" w:val="clear"/>
+        <w:spacing w:after="0" w:before="0" w:line="240" w:lineRule="auto"/>
+        <w:ind w:left="0" w:right="0" w:firstLine="567"/>
+        <w:jc w:val="both"/>
+        <w:rPr/>
+      </w:pPr>
+      <w:r>
+        <w:rPr>
+          <w:rFonts w:ascii="Trebuchet MS" w:cs="Trebuchet MS" w:eastAsia="Trebuchet MS" w:hAnsi="Trebuchet MS"/>
+          <w:b w:val="0"/>
+          <w:bCs w:val="0"/>
+          <w:i w:val="0"/>
+          <w:iCs w:val="0"/>
+          <w:smallCaps w:val="0"/>
+          <w:strike w:val="0"/>
+          <w:color w:val="000000"/>
+          <w:sz w:val="22"/>
+          <w:szCs w:val="22"/>
+          <w:u w:val="none"/>
+          <w:shd w:fill="auto" w:val="clear"/>
+          <w:vertAlign w:val="baseline"/>
+          <w:rtl w:val="0"/>
+        </w:rPr>
+        <w:t xml:space="preserve">{{#show_discount}}Первоначальная стоимость составляла {{original_amount}} рублей в месяц. Скидка {{discount_percent}}% применена по соглашению сторон.{{/show_discount}}</w:t>
+      </w:r>
+    </w:p>
+    <w:p>
+      <w:pPr>
+        <w:keepNext w:val="0"/>
+        <w:keepLines w:val="0"/>
+        <w:pageBreakBefore w:val="0"/>
+        <w:widowControl w:val="0"/>
+        <w:numPr>
+          <w:ilvl w:val="1"/>
+          <w:numId w:val="10"/>
+        </w:numPr>
         <w:pBdr>
           <w:top w:color="000000" w:space="0" w:sz="0" w:val="none"/>
           <w:left w:color="000000" w:space="0" w:sz="0" w:val="none"/>

</xml_diff>

<commit_message>
Remove discount paragraph from contracts - show only final price
</commit_message>
<xml_diff>
--- a/contract_ip_template.docx
+++ b/contract_ip_template.docx
@@ -1850,93 +1850,7 @@
           <w:vertAlign w:val="baseline"/>
           <w:rtl w:val="0"/>
         </w:rPr>
-        <w:t xml:space="preserve">Два месяца обслуживания стоимость оказываемых услуг будет рассчитываться по факту выполненных услуг.</w:t>
-      </w:r>
-    </w:p>
-    <w:p>
-      <w:pPr>
-        <w:keepNext w:val="0"/>
-        <w:keepLines w:val="0"/>
-        <w:pageBreakBefore w:val="0"/>
-        <w:widowControl w:val="0"/>
-        <w:numPr>
-          <w:ilvl w:val="1"/>
-          <w:numId w:val="10"/>
-        </w:numPr>
-        <w:pBdr>
-          <w:top w:color="000000" w:space="0" w:sz="0" w:val="none"/>
-          <w:left w:color="000000" w:space="0" w:sz="0" w:val="none"/>
-          <w:bottom w:color="000000" w:space="0" w:sz="0" w:val="none"/>
-          <w:right w:color="000000" w:space="0" w:sz="0" w:val="none"/>
-          <w:between w:color="000000" w:space="0" w:sz="0" w:val="none"/>
-        </w:pBdr>
-        <w:shd w:fill="auto" w:val="clear"/>
-        <w:spacing w:after="0" w:before="0" w:line="240" w:lineRule="auto"/>
-        <w:ind w:left="0" w:right="0" w:firstLine="567"/>
-        <w:jc w:val="both"/>
-        <w:rPr/>
-      </w:pPr>
-      <w:r>
-        <w:rPr>
-          <w:rFonts w:ascii="Trebuchet MS" w:cs="Trebuchet MS" w:eastAsia="Trebuchet MS" w:hAnsi="Trebuchet MS"/>
-          <w:b w:val="0"/>
-          <w:bCs w:val="0"/>
-          <w:i w:val="0"/>
-          <w:iCs w:val="0"/>
-          <w:smallCaps w:val="0"/>
-          <w:strike w:val="0"/>
-          <w:color w:val="000000"/>
-          <w:sz w:val="22"/>
-          <w:szCs w:val="22"/>
-          <w:u w:val="none"/>
-          <w:shd w:fill="auto" w:val="clear"/>
-          <w:vertAlign w:val="baseline"/>
-          <w:rtl w:val="0"/>
-        </w:rPr>
         <w:t xml:space="preserve">{{total_amount}} ({{total_amount_words}}) рублей в месяц — стоимость услуг по настоящему договору.</w:t>
-      </w:r>
-    </w:p>
-    <w:p>
-      <w:pPr>
-        <w:keepNext w:val="0"/>
-        <w:keepLines w:val="0"/>
-        <w:pageBreakBefore w:val="0"/>
-        <w:widowControl w:val="0"/>
-        <w:numPr>
-          <w:ilvl w:val="1"/>
-          <w:numId w:val="10"/>
-        </w:numPr>
-        <w:pBdr>
-          <w:top w:color="000000" w:space="0" w:sz="0" w:val="none"/>
-          <w:left w:color="000000" w:space="0" w:sz="0" w:val="none"/>
-          <w:bottom w:color="000000" w:space="0" w:sz="0" w:val="none"/>
-          <w:right w:color="000000" w:space="0" w:sz="0" w:val="none"/>
-          <w:between w:color="000000" w:space="0" w:sz="0" w:val="none"/>
-        </w:pBdr>
-        <w:shd w:fill="auto" w:val="clear"/>
-        <w:spacing w:after="0" w:before="0" w:line="240" w:lineRule="auto"/>
-        <w:ind w:left="0" w:right="0" w:firstLine="567"/>
-        <w:jc w:val="both"/>
-        <w:rPr/>
-      </w:pPr>
-      <w:r>
-        <w:rPr>
-          <w:rFonts w:ascii="Trebuchet MS" w:cs="Trebuchet MS" w:eastAsia="Trebuchet MS" w:hAnsi="Trebuchet MS"/>
-          <w:b w:val="0"/>
-          <w:bCs w:val="0"/>
-          <w:i w:val="0"/>
-          <w:iCs w:val="0"/>
-          <w:smallCaps w:val="0"/>
-          <w:strike w:val="0"/>
-          <w:color w:val="000000"/>
-          <w:sz w:val="22"/>
-          <w:szCs w:val="22"/>
-          <w:u w:val="none"/>
-          <w:shd w:fill="auto" w:val="clear"/>
-          <w:vertAlign w:val="baseline"/>
-          <w:rtl w:val="0"/>
-        </w:rPr>
-        <w:t xml:space="preserve">{{#show_discount}}Первоначальная стоимость составляла {{original_amount}} рублей в месяц. Скидка {{discount_percent}}% применена по соглашению сторон.{{/show_discount}}</w:t>
       </w:r>
     </w:p>
     <w:p>

</xml_diff>

<commit_message>
Fix contract section numbering - align all headings to numId=2
</commit_message>
<xml_diff>
--- a/contract_ip_template.docx
+++ b/contract_ip_template.docx
@@ -1785,7 +1785,7 @@
         <w:pStyle w:val="Heading2"/>
         <w:numPr>
           <w:ilvl w:val="0"/>
-          <w:numId w:val="4"/>
+          <w:numId w:val="2"/>
         </w:numPr>
         <w:pBdr>
           <w:top w:color="000000" w:space="0" w:sz="0" w:val="none"/>
@@ -2325,7 +2325,7 @@
         <w:pStyle w:val="Heading2"/>
         <w:numPr>
           <w:ilvl w:val="0"/>
-          <w:numId w:val="4"/>
+          <w:numId w:val="2"/>
         </w:numPr>
         <w:pBdr>
           <w:top w:color="000000" w:space="0" w:sz="0" w:val="none"/>
@@ -2903,7 +2903,7 @@
         <w:pStyle w:val="Heading2"/>
         <w:numPr>
           <w:ilvl w:val="0"/>
-          <w:numId w:val="4"/>
+          <w:numId w:val="2"/>
         </w:numPr>
         <w:pBdr>
           <w:top w:color="000000" w:space="0" w:sz="0" w:val="none"/>
@@ -3063,7 +3063,7 @@
         <w:pStyle w:val="Heading2"/>
         <w:numPr>
           <w:ilvl w:val="0"/>
-          <w:numId w:val="4"/>
+          <w:numId w:val="2"/>
         </w:numPr>
         <w:pBdr>
           <w:top w:color="000000" w:space="0" w:sz="0" w:val="none"/>
@@ -3343,7 +3343,7 @@
         <w:pStyle w:val="Heading2"/>
         <w:numPr>
           <w:ilvl w:val="0"/>
-          <w:numId w:val="4"/>
+          <w:numId w:val="2"/>
         </w:numPr>
         <w:pBdr>
           <w:top w:color="000000" w:space="0" w:sz="0" w:val="none"/>
@@ -3795,7 +3795,7 @@
         <w:pStyle w:val="Heading2"/>
         <w:numPr>
           <w:ilvl w:val="0"/>
-          <w:numId w:val="4"/>
+          <w:numId w:val="2"/>
         </w:numPr>
         <w:pBdr>
           <w:top w:color="000000" w:space="0" w:sz="0" w:val="none"/>
@@ -3906,7 +3906,7 @@
         <w:pStyle w:val="Heading2"/>
         <w:numPr>
           <w:ilvl w:val="0"/>
-          <w:numId w:val="4"/>
+          <w:numId w:val="2"/>
         </w:numPr>
         <w:pBdr>
           <w:top w:color="000000" w:space="0" w:sz="0" w:val="none"/>

</xml_diff>

<commit_message>
Fix sub-paragraph numbering in all contract sections (5.1, 6.1, etc.)
</commit_message>
<xml_diff>
--- a/contract_ip_template.docx
+++ b/contract_ip_template.docx
@@ -6101,7 +6101,7 @@
   </w:abstractNum>
   <w:abstractNum w:abstractNumId="5">
     <w:lvl w:ilvl="0">
-      <w:start w:val="8"/>
+      <w:start w:val="6"/>
       <w:numFmt w:val="decimal"/>
       <w:lvlText w:val="%1"/>
       <w:lvlJc w:val="left"/>
@@ -6297,7 +6297,7 @@
   </w:abstractNum>
   <w:abstractNum w:abstractNumId="7">
     <w:lvl w:ilvl="0">
-      <w:start w:val="6"/>
+      <w:start w:val="5"/>
       <w:numFmt w:val="decimal"/>
       <w:lvlText w:val="%1"/>
       <w:lvlJc w:val="left"/>

</xml_diff>

<commit_message>
Fix all section sub-paragraph numbering (5.1, 6.1, 7.1, 8.1...)
</commit_message>
<xml_diff>
--- a/contract_ip_template.docx
+++ b/contract_ip_template.docx
@@ -6101,7 +6101,7 @@
   </w:abstractNum>
   <w:abstractNum w:abstractNumId="5">
     <w:lvl w:ilvl="0">
-      <w:start w:val="6"/>
+      <w:start w:val="8"/>
       <w:numFmt w:val="decimal"/>
       <w:lvlText w:val="%1"/>
       <w:lvlJc w:val="left"/>
@@ -6297,7 +6297,7 @@
   </w:abstractNum>
   <w:abstractNum w:abstractNumId="7">
     <w:lvl w:ilvl="0">
-      <w:start w:val="5"/>
+      <w:start w:val="6"/>
       <w:numFmt w:val="decimal"/>
       <w:lvlText w:val="%1"/>
       <w:lvlJc w:val="left"/>

</xml_diff>

<commit_message>
Remove total_amount paragraph from section 3 of both contract templates
</commit_message>
<xml_diff>
--- a/contract_ip_template.docx
+++ b/contract_ip_template.docx
@@ -1778,79 +1778,6 @@
         <w:rPr>
           <w:rtl w:val="0"/>
         </w:rPr>
-      </w:r>
-    </w:p>
-    <w:p>
-      <w:pPr>
-        <w:pStyle w:val="Heading2"/>
-        <w:numPr>
-          <w:ilvl w:val="0"/>
-          <w:numId w:val="2"/>
-        </w:numPr>
-        <w:pBdr>
-          <w:top w:color="000000" w:space="0" w:sz="0" w:val="none"/>
-          <w:left w:color="000000" w:space="0" w:sz="0" w:val="none"/>
-          <w:bottom w:color="000000" w:space="0" w:sz="0" w:val="none"/>
-          <w:right w:color="000000" w:space="0" w:sz="0" w:val="none"/>
-          <w:between w:color="000000" w:space="0" w:sz="0" w:val="none"/>
-        </w:pBdr>
-        <w:tabs>
-          <w:tab w:val="left" w:leader="none" w:pos="3989"/>
-          <w:tab w:val="left" w:leader="none" w:pos="3990"/>
-        </w:tabs>
-        <w:spacing w:line="240" w:lineRule="auto"/>
-        <w:ind w:left="0" w:hanging="630"/>
-        <w:jc w:val="center"/>
-        <w:rPr/>
-      </w:pPr>
-      <w:r>
-        <w:rPr>
-          <w:rtl w:val="0"/>
-        </w:rPr>
-        <w:t xml:space="preserve">СТОИМОСТЬ РАБОТ И ПОРЯДОК РАСЧЕТОВ</w:t>
-      </w:r>
-    </w:p>
-    <w:p>
-      <w:pPr>
-        <w:keepNext w:val="0"/>
-        <w:keepLines w:val="0"/>
-        <w:pageBreakBefore w:val="0"/>
-        <w:widowControl w:val="0"/>
-        <w:numPr>
-          <w:ilvl w:val="1"/>
-          <w:numId w:val="10"/>
-        </w:numPr>
-        <w:pBdr>
-          <w:top w:color="000000" w:space="0" w:sz="0" w:val="none"/>
-          <w:left w:color="000000" w:space="0" w:sz="0" w:val="none"/>
-          <w:bottom w:color="000000" w:space="0" w:sz="0" w:val="none"/>
-          <w:right w:color="000000" w:space="0" w:sz="0" w:val="none"/>
-          <w:between w:color="000000" w:space="0" w:sz="0" w:val="none"/>
-        </w:pBdr>
-        <w:shd w:fill="auto" w:val="clear"/>
-        <w:spacing w:after="0" w:before="0" w:line="240" w:lineRule="auto"/>
-        <w:ind w:left="0" w:right="0" w:firstLine="567"/>
-        <w:jc w:val="both"/>
-        <w:rPr/>
-      </w:pPr>
-      <w:r>
-        <w:rPr>
-          <w:rFonts w:ascii="Trebuchet MS" w:cs="Trebuchet MS" w:eastAsia="Trebuchet MS" w:hAnsi="Trebuchet MS"/>
-          <w:b w:val="0"/>
-          <w:bCs w:val="0"/>
-          <w:i w:val="0"/>
-          <w:iCs w:val="0"/>
-          <w:smallCaps w:val="0"/>
-          <w:strike w:val="0"/>
-          <w:color w:val="000000"/>
-          <w:sz w:val="22"/>
-          <w:szCs w:val="22"/>
-          <w:u w:val="none"/>
-          <w:shd w:fill="auto" w:val="clear"/>
-          <w:vertAlign w:val="baseline"/>
-          <w:rtl w:val="0"/>
-        </w:rPr>
-        <w:t xml:space="preserve">{{total_amount}} ({{total_amount_words}}) рублей в месяц — стоимость услуг по настоящему договору.</w:t>
       </w:r>
     </w:p>
     <w:p>

</xml_diff>

<commit_message>
Fix contract: add section 3 heading, hardcode prepayment 20000, fix numbering
</commit_message>
<xml_diff>
--- a/contract_ip_template.docx
+++ b/contract_ip_template.docx
@@ -1782,6 +1782,35 @@
     </w:p>
     <w:p>
       <w:pPr>
+        <w:pStyle w:val="Heading2"/>
+        <w:numPr>
+          <w:ilvl w:val="0"/>
+          <w:numId w:val="2"/>
+        </w:numPr>
+        <w:pBdr>
+          <w:top w:color="000000" w:space="0" w:sz="0" w:val="none"/>
+          <w:left w:color="000000" w:space="0" w:sz="0" w:val="none"/>
+          <w:bottom w:color="000000" w:space="0" w:sz="0" w:val="none"/>
+          <w:right w:color="000000" w:space="0" w:sz="0" w:val="none"/>
+          <w:between w:color="000000" w:space="0" w:sz="0" w:val="none"/>
+        </w:pBdr>
+        <w:tabs>
+          <w:tab w:val="left" w:leader="none" w:pos="4184"/>
+        </w:tabs>
+        <w:spacing w:line="240" w:lineRule="auto"/>
+        <w:ind w:left="0" w:hanging="360"/>
+        <w:jc w:val="center"/>
+        <w:rPr/>
+      </w:pPr>
+      <w:r>
+        <w:rPr>
+          <w:rtl w:val="0"/>
+        </w:rPr>
+        <w:t xml:space="preserve">СТОИМОСТЬ РАБОТ И ПОРЯДОК РАСЧЕТОВ</w:t>
+      </w:r>
+    </w:p>
+    <w:p>
+      <w:pPr>
         <w:keepNext w:val="0"/>
         <w:keepLines w:val="0"/>
         <w:pageBreakBefore w:val="0"/>
@@ -1820,7 +1849,7 @@
           <w:vertAlign w:val="baseline"/>
           <w:rtl w:val="0"/>
         </w:rPr>
-        <w:t xml:space="preserve">Перед началом оказания услуг Заказчик внес предоплату в размере {{amount}} ({{amount_words}}) рублей.</w:t>
+        <w:t xml:space="preserve">Перед началом оказания услуг Заказчик внес предоплату в размере 20 000 (Двадцати тысяч) рублей.</w:t>
       </w:r>
     </w:p>
     <w:p>

</xml_diff>

<commit_message>
Add missing section 3.1 paragraph to contract templates
</commit_message>
<xml_diff>
--- a/contract_ip_template.docx
+++ b/contract_ip_template.docx
@@ -1807,6 +1807,49 @@
           <w:rtl w:val="0"/>
         </w:rPr>
         <w:t xml:space="preserve">СТОИМОСТЬ РАБОТ И ПОРЯДОК РАСЧЕТОВ</w:t>
+      </w:r>
+    </w:p>
+    <w:p>
+      <w:pPr>
+        <w:keepNext w:val="0"/>
+        <w:keepLines w:val="0"/>
+        <w:pageBreakBefore w:val="0"/>
+        <w:widowControl w:val="0"/>
+        <w:numPr>
+          <w:ilvl w:val="1"/>
+          <w:numId w:val="10"/>
+        </w:numPr>
+        <w:pBdr>
+          <w:top w:color="000000" w:space="0" w:sz="0" w:val="none"/>
+          <w:left w:color="000000" w:space="0" w:sz="0" w:val="none"/>
+          <w:bottom w:color="000000" w:space="0" w:sz="0" w:val="none"/>
+          <w:right w:color="000000" w:space="0" w:sz="0" w:val="none"/>
+          <w:between w:color="000000" w:space="0" w:sz="0" w:val="none"/>
+        </w:pBdr>
+        <w:shd w:fill="auto" w:val="clear"/>
+        <w:spacing w:after="0" w:before="0" w:line="240" w:lineRule="auto"/>
+        <w:ind w:left="0" w:right="0" w:firstLine="567"/>
+        <w:jc w:val="both"/>
+        <w:rPr/>
+      </w:pPr>
+      <w:r>
+        <w:rPr>
+          <w:rFonts w:ascii="Trebuchet MS" w:cs="Trebuchet MS" w:eastAsia="Trebuchet MS" w:hAnsi="Trebuchet MS"/>
+          <w:b w:val="0"/>
+          <w:bCs w:val="0"/>
+          <w:i w:val="0"/>
+          <w:iCs w:val="0"/>
+          <w:smallCaps w:val="0"/>
+          <w:strike w:val="0"/>
+          <w:color w:val="000000"/>
+          <w:sz w:val="22"/>
+          <w:szCs w:val="22"/>
+          <w:u w:val="none"/>
+          <w:shd w:fill="auto" w:val="clear"/>
+          <w:vertAlign w:val="baseline"/>
+          <w:rtl w:val="0"/>
+        </w:rPr>
+        <w:t xml:space="preserve">Два месяца обслуживания стоимость оказываемых услуг будет рассчитываться по факту выполненных услуг.</w:t>
       </w:r>
     </w:p>
     <w:p>

</xml_diff>